<commit_message>
feat: actualizar entregables PT App e1-e9 y sincronizar DOCX
Correcciones funcionales:
- ptcalc/R/pt_homogeneity.R: firma polimorfica calculate_homogeneity_criterion_expanded (2 o 3 args)
- ptcalc/R/ptcalc-package.R: ISO 17043:2024 -> 2023
- app.R: normalizar Insatisfactorio -> No satisfactorio (10+ lugares)

Documental:
- e1.md-e9.md: secciones de trazabilidad 2026-06-16 con estado recomendado
- formulas_y_ejemplos.md: corregir enlace zeta, tablas Markdown, observacion conceptual
- bitacora_actualizacion_260616.md: matriz de discrepancias y riesgos

Subagentes implementadores:
- E02: lista_funciones.R y test corregidos, 77 funciones, 36/36 PASS
- E03: ejemplo y test corregidos, 57 PASS
- E04: test corregido, ejecutado sin fallos
- E08/E09: funciones_finales.R y genera_anexos.R corregidos, 6 CSVs generados

DOCX: 15 archivos regenerados con pandoc desde MD actualizados
- Corregir error TeX en anexo_calculos.md antes de conversion

Refs: 260616_1047_plan_actualizar-entregables-pt-app.md
</commit_message>
<xml_diff>
--- a/Entregables_pt_app/01_repo_inicial/tests/test_01_existencia_archivos.docx
+++ b/Entregables_pt_app/01_repo_inicial/tests/test_01_existencia_archivos.docx
@@ -219,7 +219,7 @@
         <w:rPr>
           <w:rStyle w:val="VerbatimChar"/>
         </w:rPr>
-        <w:t xml:space="preserve">deliv/01_repo_inicial/</w:t>
+        <w:t xml:space="preserve">Entregables_pt_app/01_repo_inicial/</w:t>
       </w:r>
     </w:p>
     <w:p>
@@ -493,7 +493,7 @@
         <w:rPr>
           <w:rStyle w:val="StringTok"/>
         </w:rPr>
-        <w:t xml:space="preserve">"deliv/01_repo_inicial/tests"</w:t>
+        <w:t xml:space="preserve">"Entregables_pt_app/01_repo_inicial/tests"</w:t>
       </w:r>
       <w:r>
         <w:rPr>
@@ -607,7 +607,7 @@
         <w:rPr>
           <w:rStyle w:val="StringTok"/>
         </w:rPr>
-        <w:t xml:space="preserve">"deliv/01_repo_inicial/tests/test_01_existencia_archivos.R"</w:t>
+        <w:t xml:space="preserve">"Entregables_pt_app/01_repo_inicial/tests/test_01_existencia_archivos.R"</w:t>
       </w:r>
       <w:r>
         <w:rPr>
@@ -640,7 +640,7 @@
         <w:rPr>
           <w:rStyle w:val="NormalTok"/>
         </w:rPr>
-        <w:t xml:space="preserve"> deliv/01_repo_inicial/tests/test_01_existencia_archivos.R</w:t>
+        <w:t xml:space="preserve"> Entregables_pt_app/01_repo_inicial/tests/test_01_existencia_archivos.R</w:t>
       </w:r>
     </w:p>
     <w:bookmarkEnd w:id="17"/>
@@ -814,7 +814,7 @@
         <w:rPr>
           <w:rStyle w:val="VerbatimChar"/>
         </w:rPr>
-        <w:t xml:space="preserve">Resultados guardados en: deliv/01_repo_inicial/test_01_resultados.csv</w:t>
+        <w:t xml:space="preserve">Resultados guardados en: Entregables_pt_app/01_repo_inicial/test_01_resultados.csv</w:t>
       </w:r>
     </w:p>
     <w:bookmarkEnd w:id="19"/>
@@ -1229,7 +1229,7 @@
         <w:rPr>
           <w:rStyle w:val="VerbatimChar"/>
         </w:rPr>
-        <w:t xml:space="preserve">deliv/01_repo_inicial/</w:t>
+        <w:t xml:space="preserve">Entregables_pt_app/01_repo_inicial/</w:t>
       </w:r>
       <w:r>
         <w:t xml:space="preserve"> </w:t>

</xml_diff>